<commit_message>
Main menu, fixes visual issues
Now there's a main menu and general scale manager (which rescales buttons/text/etc. for different screen sizes and resolutions)

It also saves your current level, but haven't tested that yet, as there's only a single level.

I updated the buttons to look nicer (and have access to new menu buttons).

I also updated the background (made it a shader instead of sprite), made a tile falling animation for when you win/lose the level, fiddled with depth sorting again, that kind of fun.
</commit_message>
<xml_diff>
--- a/Story notes.docx
+++ b/Story notes.docx
@@ -31,15 +31,6 @@
           <w:lang w:val="en-US"/>
         </w:rPr>
       </w:pPr>
-    </w:p>
-    <w:p>
-      <w:pPr>
-        <w:rPr>
-          <w:rFonts w:cstheme="minorHAnsi"/>
-          <w:b/>
-          <w:lang w:val="en-US"/>
-        </w:rPr>
-      </w:pPr>
       <w:r>
         <w:rPr>
           <w:rFonts w:cstheme="minorHAnsi"/>
@@ -225,7 +216,21 @@
           <w:rFonts w:cstheme="minorHAnsi"/>
           <w:lang w:val="en-US"/>
         </w:rPr>
-        <w:t>Or, as the witch liked to say, “</w:t>
+        <w:t>Or, as th</w:t>
+      </w:r>
+      <w:r>
+        <w:rPr>
+          <w:rFonts w:cstheme="minorHAnsi"/>
+          <w:lang w:val="en-US"/>
+        </w:rPr>
+        <w:t>at</w:t>
+      </w:r>
+      <w:r>
+        <w:rPr>
+          <w:rFonts w:cstheme="minorHAnsi"/>
+          <w:lang w:val="en-US"/>
+        </w:rPr>
+        <w:t xml:space="preserve"> witch liked to say, “</w:t>
       </w:r>
       <w:r>
         <w:rPr>
@@ -514,39 +519,1510 @@
           <w:rFonts w:cstheme="minorHAnsi"/>
           <w:lang w:val="en-US"/>
         </w:rPr>
-        <w:t xml:space="preserve"> Players can NEVER</w:t>
+        <w:t xml:space="preserve"> Players can NEVER look at each other.</w:t>
+      </w:r>
+    </w:p>
+    <w:p>
+      <w:pPr>
+        <w:rPr>
+          <w:rFonts w:cstheme="minorHAnsi"/>
+          <w:lang w:val="en-US"/>
+        </w:rPr>
+      </w:pPr>
+      <w:r>
+        <w:rPr>
+          <w:rFonts w:cstheme="minorHAnsi"/>
+          <w:b/>
+          <w:lang w:val="en-US"/>
+        </w:rPr>
+        <w:t>Rule #2:</w:t>
+      </w:r>
+      <w:r>
+        <w:rPr>
+          <w:rFonts w:cstheme="minorHAnsi"/>
+          <w:lang w:val="en-US"/>
+        </w:rPr>
+        <w:t xml:space="preserve"> To win the stage, one player must step backwards from a height, and fall on top of the other player (“into their arms”)</w:t>
+      </w:r>
+    </w:p>
+    <w:p>
+      <w:pPr>
+        <w:rPr>
+          <w:rFonts w:cstheme="minorHAnsi"/>
+          <w:lang w:val="en-US"/>
+        </w:rPr>
+      </w:pPr>
+    </w:p>
+    <w:p>
+      <w:pPr>
+        <w:rPr>
+          <w:rFonts w:cstheme="minorHAnsi"/>
+          <w:lang w:val="en-US"/>
+        </w:rPr>
+      </w:pPr>
+      <w:r>
+        <w:rPr>
+          <w:rFonts w:cstheme="minorHAnsi"/>
+          <w:lang w:val="en-US"/>
+        </w:rPr>
+        <w:br w:type="page"/>
+      </w:r>
+    </w:p>
+    <w:p>
+      <w:pPr>
+        <w:rPr>
+          <w:rFonts w:ascii="Sunshiney" w:hAnsi="Sunshiney"/>
+          <w:b/>
+          <w:sz w:val="64"/>
+          <w:szCs w:val="64"/>
+          <w:lang w:val="en-US"/>
+        </w:rPr>
+      </w:pPr>
+      <w:r>
+        <w:rPr>
+          <w:rFonts w:ascii="Sunshiney" w:hAnsi="Sunshiney"/>
+          <w:b/>
+          <w:sz w:val="64"/>
+          <w:szCs w:val="64"/>
+          <w:lang w:val="en-US"/>
+        </w:rPr>
+        <w:lastRenderedPageBreak/>
+        <w:t>Links/info/remarks</w:t>
+      </w:r>
+    </w:p>
+    <w:p>
+      <w:pPr>
+        <w:rPr>
+          <w:rFonts w:cstheme="minorHAnsi"/>
+          <w:b/>
+          <w:lang w:val="en-US"/>
+        </w:rPr>
+      </w:pPr>
+    </w:p>
+    <w:p>
+      <w:pPr>
+        <w:rPr>
+          <w:rFonts w:cstheme="minorHAnsi"/>
+          <w:lang w:val="en-US"/>
+        </w:rPr>
+      </w:pPr>
+      <w:r>
+        <w:rPr>
+          <w:rFonts w:cstheme="minorHAnsi"/>
+          <w:b/>
+          <w:lang w:val="en-US"/>
+        </w:rPr>
+        <w:t>LINKS</w:t>
+      </w:r>
+      <w:r>
+        <w:rPr>
+          <w:rFonts w:cstheme="minorHAnsi"/>
+          <w:lang w:val="en-US"/>
+        </w:rPr>
+        <w:t xml:space="preserve"> (mostly on isometric calculations/conversion/depth sorting):</w:t>
+      </w:r>
+    </w:p>
+    <w:p>
+      <w:pPr>
+        <w:rPr>
+          <w:rFonts w:cstheme="minorHAnsi"/>
+          <w:lang w:val="en-US"/>
+        </w:rPr>
+      </w:pPr>
+      <w:hyperlink r:id="rId5" w:history="1">
+        <w:r>
+          <w:rPr>
+            <w:rStyle w:val="Hyperlink"/>
+            <w:rFonts w:cstheme="minorHAnsi"/>
+            <w:lang w:val="en-US"/>
+          </w:rPr>
+          <w:t>https://gamedev.stackexchange.com/questions/8151/how-do-i-sort-isometric-sprites-into-the-correct-order</w:t>
+        </w:r>
+      </w:hyperlink>
+      <w:r>
+        <w:rPr>
+          <w:rFonts w:cstheme="minorHAnsi"/>
+          <w:lang w:val="en-US"/>
+        </w:rPr>
+        <w:t xml:space="preserve"> (link to pigeonhole algorithm was also useful)</w:t>
+      </w:r>
+    </w:p>
+    <w:p>
+      <w:pPr>
+        <w:rPr>
+          <w:rFonts w:cstheme="minorHAnsi"/>
+          <w:lang w:val="en-US"/>
+        </w:rPr>
+      </w:pPr>
+      <w:hyperlink r:id="rId6" w:history="1">
+        <w:r>
+          <w:rPr>
+            <w:rStyle w:val="Hyperlink"/>
+            <w:rFonts w:cstheme="minorHAnsi"/>
+            <w:lang w:val="en-US"/>
+          </w:rPr>
+          <w:t>https://gamedev.stackexchange.com/questions/8151/how-do-i-sort-isometric-sprites-into-the-correct-order/8181#8181</w:t>
+        </w:r>
+      </w:hyperlink>
+    </w:p>
+    <w:p>
+      <w:pPr>
+        <w:rPr>
+          <w:rFonts w:cstheme="minorHAnsi"/>
+          <w:lang w:val="en-US"/>
+        </w:rPr>
+      </w:pPr>
+      <w:hyperlink r:id="rId7" w:history="1">
+        <w:r>
+          <w:rPr>
+            <w:rStyle w:val="Hyperlink"/>
+            <w:rFonts w:cstheme="minorHAnsi"/>
+            <w:lang w:val="en-US"/>
+          </w:rPr>
+          <w:t>https://gamedev.stackexchange.com/questions/14070/tile-based-isometric-depth-sorting-on-different-size-objects?rq=1</w:t>
+        </w:r>
+      </w:hyperlink>
+    </w:p>
+    <w:p>
+      <w:pPr>
+        <w:rPr>
+          <w:rFonts w:cstheme="minorHAnsi"/>
+          <w:b/>
+          <w:lang w:val="en-US"/>
+        </w:rPr>
+      </w:pPr>
+    </w:p>
+    <w:p>
+      <w:pPr>
+        <w:rPr>
+          <w:rFonts w:cstheme="minorHAnsi"/>
+          <w:b/>
+          <w:lang w:val="en-US"/>
+        </w:rPr>
+      </w:pPr>
+      <w:r>
+        <w:rPr>
+          <w:rFonts w:cstheme="minorHAnsi"/>
+          <w:b/>
+          <w:lang w:val="en-US"/>
+        </w:rPr>
+        <w:br w:type="page"/>
+      </w:r>
+    </w:p>
+    <w:p>
+      <w:pPr>
+        <w:rPr>
+          <w:rFonts w:cstheme="minorHAnsi"/>
+          <w:lang w:val="en-US"/>
+        </w:rPr>
+      </w:pPr>
+      <w:r>
+        <w:rPr>
+          <w:rFonts w:cstheme="minorHAnsi"/>
+          <w:b/>
+          <w:lang w:val="en-US"/>
+        </w:rPr>
+        <w:lastRenderedPageBreak/>
+        <w:t>INTERESTING VIDEO:</w:t>
+      </w:r>
+      <w:r>
+        <w:rPr>
+          <w:rFonts w:cstheme="minorHAnsi"/>
+          <w:lang w:val="en-US"/>
+        </w:rPr>
+        <w:t xml:space="preserve"> 8 common game architecture/code mistakes</w:t>
+      </w:r>
+    </w:p>
+    <w:p>
+      <w:pPr>
+        <w:ind w:left="708"/>
+        <w:rPr>
+          <w:rFonts w:cstheme="minorHAnsi"/>
+          <w:lang w:val="en-US"/>
+        </w:rPr>
+      </w:pPr>
+      <w:r>
+        <w:rPr>
+          <w:rFonts w:cstheme="minorHAnsi"/>
+          <w:b/>
+          <w:lang w:val="en-US"/>
+        </w:rPr>
+        <w:t xml:space="preserve">URL: </w:t>
+      </w:r>
+      <w:hyperlink r:id="rId8" w:history="1">
+        <w:r>
+          <w:rPr>
+            <w:rStyle w:val="Hyperlink"/>
+            <w:rFonts w:cstheme="minorHAnsi"/>
+            <w:lang w:val="en-US"/>
+          </w:rPr>
+          <w:t>https://www.youtube.com/watch?v=8Hy4JvtfUb8</w:t>
+        </w:r>
+      </w:hyperlink>
+    </w:p>
+    <w:p>
+      <w:pPr>
+        <w:rPr>
+          <w:rFonts w:cstheme="minorHAnsi"/>
+          <w:lang w:val="en-US"/>
+        </w:rPr>
+      </w:pPr>
+      <w:r>
+        <w:rPr>
+          <w:rFonts w:cstheme="minorHAnsi"/>
+          <w:b/>
+          <w:lang w:val="en-US"/>
+        </w:rPr>
+        <w:t>Mistake #1</w:t>
+      </w:r>
+      <w:r>
+        <w:rPr>
+          <w:rFonts w:cstheme="minorHAnsi"/>
+          <w:lang w:val="en-US"/>
+        </w:rPr>
+        <w:t>: Having game logic inside the UI</w:t>
+      </w:r>
+    </w:p>
+    <w:p>
+      <w:pPr>
+        <w:pStyle w:val="ListParagraph"/>
+        <w:numPr>
+          <w:ilvl w:val="0"/>
+          <w:numId w:val="2"/>
+        </w:numPr>
+        <w:rPr>
+          <w:rFonts w:cstheme="minorHAnsi"/>
+          <w:lang w:val="en-US"/>
+        </w:rPr>
+      </w:pPr>
+      <w:r>
+        <w:rPr>
+          <w:rFonts w:cstheme="minorHAnsi"/>
+          <w:lang w:val="en-US"/>
+        </w:rPr>
+        <w:t>Don’t store/modify actual game data within the UI</w:t>
+      </w:r>
+    </w:p>
+    <w:p>
+      <w:pPr>
+        <w:pStyle w:val="ListParagraph"/>
+        <w:numPr>
+          <w:ilvl w:val="0"/>
+          <w:numId w:val="2"/>
+        </w:numPr>
+        <w:rPr>
+          <w:rFonts w:cstheme="minorHAnsi"/>
+          <w:lang w:val="en-US"/>
+        </w:rPr>
+      </w:pPr>
+      <w:r>
+        <w:rPr>
+          <w:rFonts w:cstheme="minorHAnsi"/>
+          <w:lang w:val="en-US"/>
+        </w:rPr>
+        <w:t>Don’t calculate/evaluate game logic within the UI</w:t>
+      </w:r>
+    </w:p>
+    <w:p>
+      <w:pPr>
+        <w:pStyle w:val="ListParagraph"/>
+        <w:numPr>
+          <w:ilvl w:val="0"/>
+          <w:numId w:val="2"/>
+        </w:numPr>
+        <w:rPr>
+          <w:rFonts w:cstheme="minorHAnsi"/>
+          <w:lang w:val="en-US"/>
+        </w:rPr>
+      </w:pPr>
+      <w:r>
+        <w:rPr>
+          <w:rFonts w:cstheme="minorHAnsi"/>
+          <w:lang w:val="en-US"/>
+        </w:rPr>
+        <w:t>Instead, let the game logic call the UI manager whenever something changes/is needed</w:t>
+      </w:r>
+    </w:p>
+    <w:p>
+      <w:pPr>
+        <w:pStyle w:val="ListParagraph"/>
+        <w:numPr>
+          <w:ilvl w:val="0"/>
+          <w:numId w:val="2"/>
+        </w:numPr>
+        <w:rPr>
+          <w:rFonts w:cstheme="minorHAnsi"/>
+          <w:lang w:val="en-US"/>
+        </w:rPr>
+      </w:pPr>
+      <w:r>
+        <w:rPr>
+          <w:rFonts w:cstheme="minorHAnsi"/>
+          <w:lang w:val="en-US"/>
+        </w:rPr>
+        <w:t xml:space="preserve">Also: if the menu has many different states, create a </w:t>
+      </w:r>
+      <w:r>
+        <w:rPr>
+          <w:rFonts w:cstheme="minorHAnsi"/>
+          <w:i/>
+          <w:lang w:val="en-US"/>
+        </w:rPr>
+        <w:t>state manager</w:t>
+      </w:r>
+      <w:r>
+        <w:rPr>
+          <w:rFonts w:cstheme="minorHAnsi"/>
+          <w:lang w:val="en-US"/>
+        </w:rPr>
+        <w:t xml:space="preserve"> for it. The state manager ensures the current state is always correct =&gt; once this state is determined, that’s when it calls the UI to update it</w:t>
+      </w:r>
+    </w:p>
+    <w:p>
+      <w:pPr>
+        <w:rPr>
+          <w:rFonts w:cstheme="minorHAnsi"/>
+          <w:lang w:val="en-US"/>
+        </w:rPr>
+      </w:pPr>
+    </w:p>
+    <w:p>
+      <w:pPr>
+        <w:rPr>
+          <w:rFonts w:cstheme="minorHAnsi"/>
+          <w:lang w:val="en-US"/>
+        </w:rPr>
+      </w:pPr>
+      <w:r>
+        <w:rPr>
+          <w:rFonts w:cstheme="minorHAnsi"/>
+          <w:b/>
+          <w:lang w:val="en-US"/>
+        </w:rPr>
+        <w:t>Mistake #2:</w:t>
+      </w:r>
+      <w:r>
+        <w:rPr>
+          <w:rFonts w:cstheme="minorHAnsi"/>
+          <w:lang w:val="en-US"/>
+        </w:rPr>
+        <w:t xml:space="preserve"> Having giant, monolithic, single classes</w:t>
+      </w:r>
+    </w:p>
+    <w:p>
+      <w:pPr>
+        <w:pStyle w:val="ListParagraph"/>
+        <w:numPr>
+          <w:ilvl w:val="0"/>
+          <w:numId w:val="3"/>
+        </w:numPr>
+        <w:rPr>
+          <w:rFonts w:cstheme="minorHAnsi"/>
+          <w:lang w:val="en-US"/>
+        </w:rPr>
+      </w:pPr>
+      <w:r>
+        <w:rPr>
+          <w:rFonts w:cstheme="minorHAnsi"/>
+          <w:lang w:val="en-US"/>
+        </w:rPr>
+        <w:t>Don’t put different functionality into the same class =&gt; 1000 lines is already a bit too much, more than that is most likely a problem</w:t>
+      </w:r>
+    </w:p>
+    <w:p>
+      <w:pPr>
+        <w:pStyle w:val="ListParagraph"/>
+        <w:numPr>
+          <w:ilvl w:val="0"/>
+          <w:numId w:val="3"/>
+        </w:numPr>
+        <w:rPr>
+          <w:rFonts w:cstheme="minorHAnsi"/>
+          <w:lang w:val="en-US"/>
+        </w:rPr>
+      </w:pPr>
+      <w:r>
+        <w:rPr>
+          <w:rFonts w:cstheme="minorHAnsi"/>
+          <w:lang w:val="en-US"/>
+        </w:rPr>
+        <w:t>Why does it happen? At first, it’s very easy: only a single file, don’t need to connect/reference anything. It usually happens as a side-effect (it just grows over time)</w:t>
+      </w:r>
+    </w:p>
+    <w:p>
+      <w:pPr>
+        <w:pStyle w:val="ListParagraph"/>
+        <w:numPr>
+          <w:ilvl w:val="0"/>
+          <w:numId w:val="3"/>
+        </w:numPr>
+        <w:rPr>
+          <w:rFonts w:cstheme="minorHAnsi"/>
+          <w:lang w:val="en-US"/>
+        </w:rPr>
+      </w:pPr>
+      <w:r>
+        <w:rPr>
+          <w:rFonts w:cstheme="minorHAnsi"/>
+          <w:lang w:val="en-US"/>
+        </w:rPr>
+        <w:t>Solution? Clean things as you’re working. Split things into parts that make sense as you go.</w:t>
+      </w:r>
+    </w:p>
+    <w:p>
+      <w:pPr>
+        <w:pStyle w:val="ListParagraph"/>
+        <w:numPr>
+          <w:ilvl w:val="0"/>
+          <w:numId w:val="3"/>
+        </w:numPr>
+        <w:rPr>
+          <w:rFonts w:cstheme="minorHAnsi"/>
+          <w:lang w:val="en-US"/>
+        </w:rPr>
+      </w:pPr>
+      <w:r>
+        <w:rPr>
+          <w:rFonts w:cstheme="minorHAnsi"/>
+          <w:lang w:val="en-US"/>
+        </w:rPr>
+        <w:t>If you see your class getting 200-300 lines long =&gt; investigate it!</w:t>
+      </w:r>
+      <w:r>
+        <w:rPr>
+          <w:rFonts w:cstheme="minorHAnsi"/>
+          <w:lang w:val="en-US"/>
+        </w:rPr>
+        <w:t xml:space="preserve"> Is the class doing too many things?</w:t>
+      </w:r>
+    </w:p>
+    <w:p>
+      <w:pPr>
+        <w:rPr>
+          <w:rFonts w:cstheme="minorHAnsi"/>
+          <w:lang w:val="en-US"/>
+        </w:rPr>
+      </w:pPr>
+    </w:p>
+    <w:p>
+      <w:pPr>
+        <w:rPr>
+          <w:rFonts w:cstheme="minorHAnsi"/>
+          <w:lang w:val="en-US"/>
+        </w:rPr>
+      </w:pPr>
+      <w:r>
+        <w:rPr>
+          <w:rFonts w:cstheme="minorHAnsi"/>
+          <w:b/>
+          <w:lang w:val="en-US"/>
+        </w:rPr>
+        <w:t>Mistake #3:</w:t>
+      </w:r>
+      <w:r>
+        <w:rPr>
+          <w:rFonts w:cstheme="minorHAnsi"/>
+          <w:lang w:val="en-US"/>
+        </w:rPr>
+        <w:t xml:space="preserve"> Having everything public</w:t>
+      </w:r>
+    </w:p>
+    <w:p>
+      <w:pPr>
+        <w:pStyle w:val="ListParagraph"/>
+        <w:numPr>
+          <w:ilvl w:val="0"/>
+          <w:numId w:val="4"/>
+        </w:numPr>
+        <w:rPr>
+          <w:rFonts w:cstheme="minorHAnsi"/>
+          <w:lang w:val="en-US"/>
+        </w:rPr>
+      </w:pPr>
+      <w:r>
+        <w:rPr>
+          <w:rFonts w:cstheme="minorHAnsi"/>
+          <w:lang w:val="en-US"/>
+        </w:rPr>
+        <w:t>(This was mostly relevant for Unity3D. Too many things are exposed to the inspector =&gt; which means too many things become interconnected or data is lost. For example: you can’t get the original value for something without referencing back to the original prefab.)</w:t>
+      </w:r>
+    </w:p>
+    <w:p>
+      <w:pPr>
+        <w:pStyle w:val="ListParagraph"/>
+        <w:numPr>
+          <w:ilvl w:val="0"/>
+          <w:numId w:val="4"/>
+        </w:numPr>
+        <w:rPr>
+          <w:rFonts w:cstheme="minorHAnsi"/>
+          <w:lang w:val="en-US"/>
+        </w:rPr>
+      </w:pPr>
+      <w:r>
+        <w:rPr>
+          <w:rFonts w:cstheme="minorHAnsi"/>
+          <w:lang w:val="en-US"/>
+        </w:rPr>
+        <w:t xml:space="preserve">You only want things to be public if they are </w:t>
+      </w:r>
+      <w:r>
+        <w:rPr>
+          <w:rFonts w:cstheme="minorHAnsi"/>
+          <w:i/>
+          <w:lang w:val="en-US"/>
+        </w:rPr>
+        <w:t>intended to be used by another class</w:t>
+      </w:r>
+      <w:r>
+        <w:rPr>
+          <w:rFonts w:cstheme="minorHAnsi"/>
+          <w:lang w:val="en-US"/>
+        </w:rPr>
+        <w:t>.</w:t>
+      </w:r>
+    </w:p>
+    <w:p>
+      <w:pPr>
+        <w:rPr>
+          <w:rFonts w:cstheme="minorHAnsi"/>
+          <w:lang w:val="en-US"/>
+        </w:rPr>
+      </w:pPr>
+    </w:p>
+    <w:p>
+      <w:pPr>
+        <w:rPr>
+          <w:rFonts w:cstheme="minorHAnsi"/>
+          <w:lang w:val="en-US"/>
+        </w:rPr>
+      </w:pPr>
+      <w:r>
+        <w:rPr>
+          <w:rFonts w:cstheme="minorHAnsi"/>
+          <w:b/>
+          <w:lang w:val="en-US"/>
+        </w:rPr>
+        <w:t>Mistake #4:</w:t>
+      </w:r>
+      <w:r>
+        <w:rPr>
+          <w:rFonts w:cstheme="minorHAnsi"/>
+          <w:lang w:val="en-US"/>
+        </w:rPr>
+        <w:t xml:space="preserve"> Having setters with side-effects</w:t>
+      </w:r>
+    </w:p>
+    <w:p>
+      <w:pPr>
+        <w:pStyle w:val="ListParagraph"/>
+        <w:numPr>
+          <w:ilvl w:val="0"/>
+          <w:numId w:val="5"/>
+        </w:numPr>
+        <w:rPr>
+          <w:rFonts w:cstheme="minorHAnsi"/>
+          <w:lang w:val="en-US"/>
+        </w:rPr>
+      </w:pPr>
+      <w:r>
+        <w:rPr>
+          <w:rFonts w:cstheme="minorHAnsi"/>
+          <w:lang w:val="en-US"/>
+        </w:rPr>
+        <w:t xml:space="preserve">If a setter isn’t just </w:t>
+      </w:r>
+      <w:r>
+        <w:rPr>
+          <w:rFonts w:cstheme="minorHAnsi"/>
+          <w:i/>
+          <w:lang w:val="en-US"/>
+        </w:rPr>
+        <w:t>setting the value</w:t>
+      </w:r>
+      <w:r>
+        <w:rPr>
+          <w:rFonts w:cstheme="minorHAnsi"/>
+          <w:lang w:val="en-US"/>
+        </w:rPr>
+        <w:t>, but doing other stuff as well, there will be problems in many ways.</w:t>
+      </w:r>
+    </w:p>
+    <w:p>
+      <w:pPr>
+        <w:pStyle w:val="ListParagraph"/>
+        <w:numPr>
+          <w:ilvl w:val="0"/>
+          <w:numId w:val="5"/>
+        </w:numPr>
+        <w:rPr>
+          <w:rFonts w:cstheme="minorHAnsi"/>
+          <w:lang w:val="en-US"/>
+        </w:rPr>
+      </w:pPr>
+      <w:r>
+        <w:rPr>
+          <w:rFonts w:cstheme="minorHAnsi"/>
+          <w:lang w:val="en-US"/>
+        </w:rPr>
+        <w:t>Within that side-effect, something else might be happening. Thus, you get a chain reaction. (Or, that side-effect might take a lot of time, causing the whole setter to become slow/grind to a halt.)</w:t>
+      </w:r>
+    </w:p>
+    <w:p>
+      <w:pPr>
+        <w:pStyle w:val="ListParagraph"/>
+        <w:numPr>
+          <w:ilvl w:val="0"/>
+          <w:numId w:val="5"/>
+        </w:numPr>
+        <w:rPr>
+          <w:rFonts w:cstheme="minorHAnsi"/>
+          <w:lang w:val="en-US"/>
+        </w:rPr>
+      </w:pPr>
+      <w:r>
+        <w:rPr>
+          <w:rFonts w:cstheme="minorHAnsi"/>
+          <w:lang w:val="en-US"/>
+        </w:rPr>
+        <w:t xml:space="preserve">It’s NOT </w:t>
+      </w:r>
+      <w:r>
+        <w:rPr>
+          <w:rFonts w:cstheme="minorHAnsi"/>
+          <w:lang w:val="en-US"/>
+        </w:rPr>
+        <w:t xml:space="preserve">necessarily </w:t>
+      </w:r>
+      <w:r>
+        <w:rPr>
+          <w:rFonts w:cstheme="minorHAnsi"/>
+          <w:lang w:val="en-US"/>
+        </w:rPr>
+        <w:t>a problem to have a setter with side-effects</w:t>
+      </w:r>
+      <w:r>
+        <w:rPr>
+          <w:rFonts w:cstheme="minorHAnsi"/>
+          <w:lang w:val="en-US"/>
+        </w:rPr>
+        <w:t xml:space="preserve">, </w:t>
+      </w:r>
+      <w:r>
+        <w:rPr>
+          <w:rFonts w:cstheme="minorHAnsi"/>
+          <w:lang w:val="en-US"/>
+        </w:rPr>
+        <w:t>it’s a problem to HIDE it.</w:t>
+      </w:r>
+      <w:r>
+        <w:rPr>
+          <w:rFonts w:cstheme="minorHAnsi"/>
+          <w:lang w:val="en-US"/>
+        </w:rPr>
+        <w:t xml:space="preserve"> </w:t>
+      </w:r>
+    </w:p>
+    <w:p>
+      <w:pPr>
+        <w:pStyle w:val="ListParagraph"/>
+        <w:numPr>
+          <w:ilvl w:val="0"/>
+          <w:numId w:val="5"/>
+        </w:numPr>
+        <w:rPr>
+          <w:rFonts w:cstheme="minorHAnsi"/>
+          <w:lang w:val="en-US"/>
+        </w:rPr>
+      </w:pPr>
+      <w:r>
+        <w:rPr>
+          <w:rFonts w:cstheme="minorHAnsi"/>
+          <w:lang w:val="en-US"/>
+        </w:rPr>
+        <w:t>Solution? Make setters extremely simple: just set/get something. If you want extra functionality, wrap a function around it that calls both the setter and the extra functionality.</w:t>
+      </w:r>
+    </w:p>
+    <w:p>
+      <w:pPr>
+        <w:rPr>
+          <w:rFonts w:cstheme="minorHAnsi"/>
+          <w:lang w:val="en-US"/>
+        </w:rPr>
+      </w:pPr>
+    </w:p>
+    <w:p>
+      <w:pPr>
+        <w:rPr>
+          <w:rFonts w:cstheme="minorHAnsi"/>
+          <w:lang w:val="en-US"/>
+        </w:rPr>
+      </w:pPr>
+      <w:r>
+        <w:rPr>
+          <w:rFonts w:cstheme="minorHAnsi"/>
+          <w:b/>
+          <w:lang w:val="en-US"/>
+        </w:rPr>
+        <w:t>Mistake #</w:t>
+      </w:r>
+      <w:r>
+        <w:rPr>
+          <w:rFonts w:cstheme="minorHAnsi"/>
+          <w:b/>
+          <w:lang w:val="en-US"/>
+        </w:rPr>
+        <w:t>5</w:t>
+      </w:r>
+      <w:r>
+        <w:rPr>
+          <w:rFonts w:cstheme="minorHAnsi"/>
+          <w:b/>
+          <w:lang w:val="en-US"/>
+        </w:rPr>
+        <w:t>:</w:t>
+      </w:r>
+      <w:r>
+        <w:rPr>
+          <w:rFonts w:cstheme="minorHAnsi"/>
+          <w:lang w:val="en-US"/>
+        </w:rPr>
+        <w:t xml:space="preserve"> </w:t>
+      </w:r>
+      <w:r>
+        <w:rPr>
+          <w:rFonts w:cstheme="minorHAnsi"/>
+          <w:lang w:val="en-US"/>
+        </w:rPr>
+        <w:t>Giant Prefabs</w:t>
+      </w:r>
+    </w:p>
+    <w:p>
+      <w:pPr>
+        <w:pStyle w:val="ListParagraph"/>
+        <w:numPr>
+          <w:ilvl w:val="0"/>
+          <w:numId w:val="6"/>
+        </w:numPr>
+        <w:rPr>
+          <w:rFonts w:cstheme="minorHAnsi"/>
+          <w:lang w:val="en-US"/>
+        </w:rPr>
+      </w:pPr>
+      <w:r>
+        <w:rPr>
+          <w:rFonts w:cstheme="minorHAnsi"/>
+          <w:lang w:val="en-US"/>
+        </w:rPr>
+        <w:lastRenderedPageBreak/>
+        <w:t>Connected to the “large monolithic classes” problem =&gt; hard to re-use functionality, hard to maintain, hard to co-operate with others</w:t>
+      </w:r>
+      <w:r>
+        <w:rPr>
+          <w:rFonts w:cstheme="minorHAnsi"/>
+          <w:lang w:val="en-US"/>
+        </w:rPr>
+        <w:t xml:space="preserve"> in a team.</w:t>
+      </w:r>
+    </w:p>
+    <w:p>
+      <w:pPr>
+        <w:pStyle w:val="ListParagraph"/>
+        <w:numPr>
+          <w:ilvl w:val="0"/>
+          <w:numId w:val="6"/>
+        </w:numPr>
+        <w:rPr>
+          <w:rFonts w:cstheme="minorHAnsi"/>
+          <w:lang w:val="en-US"/>
+        </w:rPr>
+      </w:pPr>
+      <w:r>
+        <w:rPr>
+          <w:rFonts w:cstheme="minorHAnsi"/>
+          <w:lang w:val="en-US"/>
+        </w:rPr>
+        <w:t>Solution? Split prefabs into multiple smaller prefabs. Instead of making a UI a single prefab, make the prefab a collection of smaller scenes, each of which contains part of the UI.</w:t>
+      </w:r>
+      <w:r>
+        <w:rPr>
+          <w:rFonts w:cstheme="minorHAnsi"/>
+          <w:lang w:val="en-US"/>
+        </w:rPr>
+        <w:t xml:space="preserve"> (</w:t>
+      </w:r>
+      <w:r>
+        <w:rPr>
+          <w:rFonts w:cstheme="minorHAnsi"/>
+          <w:i/>
+          <w:lang w:val="en-US"/>
+        </w:rPr>
+        <w:t>Nested prefabs</w:t>
+      </w:r>
+      <w:r>
+        <w:rPr>
+          <w:rFonts w:cstheme="minorHAnsi"/>
+          <w:lang w:val="en-US"/>
+        </w:rPr>
+        <w:t>.)</w:t>
+      </w:r>
+    </w:p>
+    <w:p>
+      <w:pPr>
+        <w:pStyle w:val="ListParagraph"/>
+        <w:numPr>
+          <w:ilvl w:val="0"/>
+          <w:numId w:val="6"/>
+        </w:numPr>
+        <w:rPr>
+          <w:rFonts w:cstheme="minorHAnsi"/>
+          <w:lang w:val="en-US"/>
+        </w:rPr>
+      </w:pPr>
+      <w:r>
+        <w:rPr>
+          <w:rFonts w:cstheme="minorHAnsi"/>
+          <w:lang w:val="en-US"/>
+        </w:rPr>
+        <w:t>Solution 2? Use prefab variants (Unity3D specific)</w:t>
+      </w:r>
+    </w:p>
+    <w:p>
+      <w:pPr>
+        <w:rPr>
+          <w:rFonts w:cstheme="minorHAnsi"/>
+          <w:lang w:val="en-US"/>
+        </w:rPr>
+      </w:pPr>
+    </w:p>
+    <w:p>
+      <w:pPr>
+        <w:rPr>
+          <w:rFonts w:cstheme="minorHAnsi"/>
+          <w:lang w:val="en-US"/>
+        </w:rPr>
+      </w:pPr>
+      <w:r>
+        <w:rPr>
+          <w:rFonts w:cstheme="minorHAnsi"/>
+          <w:b/>
+          <w:lang w:val="en-US"/>
+        </w:rPr>
+        <w:t>Mistake #</w:t>
+      </w:r>
+      <w:r>
+        <w:rPr>
+          <w:rFonts w:cstheme="minorHAnsi"/>
+          <w:b/>
+          <w:lang w:val="en-US"/>
+        </w:rPr>
+        <w:t>6</w:t>
+      </w:r>
+      <w:r>
+        <w:rPr>
+          <w:rFonts w:cstheme="minorHAnsi"/>
+          <w:b/>
+          <w:lang w:val="en-US"/>
+        </w:rPr>
+        <w:t>:</w:t>
+      </w:r>
+      <w:r>
+        <w:rPr>
+          <w:rFonts w:cstheme="minorHAnsi"/>
+          <w:lang w:val="en-US"/>
+        </w:rPr>
+        <w:t xml:space="preserve"> </w:t>
+      </w:r>
+      <w:r>
+        <w:rPr>
+          <w:rFonts w:cstheme="minorHAnsi"/>
+          <w:lang w:val="en-US"/>
+        </w:rPr>
+        <w:t xml:space="preserve">Not using </w:t>
+      </w:r>
+      <w:r>
+        <w:rPr>
+          <w:rFonts w:cstheme="minorHAnsi"/>
+          <w:lang w:val="en-US"/>
+        </w:rPr>
+        <w:t>Interfaces (Unity3D specific)</w:t>
+      </w:r>
+      <w:r>
+        <w:rPr>
+          <w:rFonts w:cstheme="minorHAnsi"/>
+          <w:lang w:val="en-US"/>
+        </w:rPr>
+        <w:t>. Using them too much is bad, using them too little is also bad.</w:t>
+      </w:r>
+    </w:p>
+    <w:p>
+      <w:pPr>
+        <w:pStyle w:val="ListParagraph"/>
+        <w:numPr>
+          <w:ilvl w:val="0"/>
+          <w:numId w:val="7"/>
+        </w:numPr>
+        <w:rPr>
+          <w:rFonts w:cstheme="minorHAnsi"/>
+          <w:lang w:val="en-US"/>
+        </w:rPr>
+      </w:pPr>
+      <w:r>
+        <w:rPr>
+          <w:rFonts w:cstheme="minorHAnsi"/>
+          <w:lang w:val="en-US"/>
+        </w:rPr>
+        <w:t>Possible use case: A system that needs to interact with two different objects, but in the same (kind of) way</w:t>
+      </w:r>
+    </w:p>
+    <w:p>
+      <w:pPr>
+        <w:pStyle w:val="ListParagraph"/>
+        <w:numPr>
+          <w:ilvl w:val="1"/>
+          <w:numId w:val="7"/>
+        </w:numPr>
+        <w:rPr>
+          <w:rFonts w:cstheme="minorHAnsi"/>
+          <w:lang w:val="en-US"/>
+        </w:rPr>
+      </w:pPr>
+      <w:r>
+        <w:rPr>
+          <w:rFonts w:cstheme="minorHAnsi"/>
+          <w:lang w:val="en-US"/>
+        </w:rPr>
+        <w:t xml:space="preserve">You </w:t>
+      </w:r>
+      <w:r>
+        <w:rPr>
+          <w:rFonts w:cstheme="minorHAnsi"/>
+          <w:i/>
+          <w:lang w:val="en-US"/>
+        </w:rPr>
+        <w:t>could</w:t>
+      </w:r>
+      <w:r>
+        <w:rPr>
+          <w:rFonts w:cstheme="minorHAnsi"/>
+          <w:lang w:val="en-US"/>
+        </w:rPr>
+        <w:t xml:space="preserve"> put the same script/node/component on both objects, or just copy code. But you run into problems: e.g. a take damage function on a player and a crate, but the player needs to react </w:t>
+      </w:r>
+      <w:r>
+        <w:rPr>
+          <w:rFonts w:cstheme="minorHAnsi"/>
+          <w:i/>
+          <w:lang w:val="en-US"/>
+        </w:rPr>
+        <w:t>differently</w:t>
+      </w:r>
+      <w:r>
+        <w:rPr>
+          <w:rFonts w:cstheme="minorHAnsi"/>
+          <w:lang w:val="en-US"/>
+        </w:rPr>
+        <w:t xml:space="preserve"> to damage than the crate.</w:t>
+      </w:r>
+    </w:p>
+    <w:p>
+      <w:pPr>
+        <w:pStyle w:val="ListParagraph"/>
+        <w:numPr>
+          <w:ilvl w:val="1"/>
+          <w:numId w:val="7"/>
+        </w:numPr>
+        <w:rPr>
+          <w:rFonts w:cstheme="minorHAnsi"/>
+          <w:lang w:val="en-US"/>
+        </w:rPr>
+      </w:pPr>
+      <w:r>
+        <w:rPr>
+          <w:rFonts w:cstheme="minorHAnsi"/>
+          <w:lang w:val="en-US"/>
+        </w:rPr>
+        <w:t xml:space="preserve">Instead, find a common interface (like an “I take damage” or “I have health”). Give it a (public) method like </w:t>
+      </w:r>
+      <w:proofErr w:type="spellStart"/>
+      <w:r>
+        <w:rPr>
+          <w:rFonts w:cstheme="minorHAnsi"/>
+          <w:lang w:val="en-US"/>
+        </w:rPr>
+        <w:t>take_</w:t>
+      </w:r>
+      <w:proofErr w:type="gramStart"/>
+      <w:r>
+        <w:rPr>
+          <w:rFonts w:cstheme="minorHAnsi"/>
+          <w:lang w:val="en-US"/>
+        </w:rPr>
+        <w:t>damage</w:t>
+      </w:r>
+      <w:proofErr w:type="spellEnd"/>
+      <w:r>
+        <w:rPr>
+          <w:rFonts w:cstheme="minorHAnsi"/>
+          <w:lang w:val="en-US"/>
+        </w:rPr>
+        <w:t>(</w:t>
+      </w:r>
+      <w:proofErr w:type="gramEnd"/>
+      <w:r>
+        <w:rPr>
+          <w:rFonts w:cstheme="minorHAnsi"/>
+          <w:lang w:val="en-US"/>
+        </w:rPr>
+        <w:t>). Then you make both health components implement that interface – but in different ways.</w:t>
+      </w:r>
+    </w:p>
+    <w:p>
+      <w:pPr>
+        <w:pStyle w:val="ListParagraph"/>
+        <w:numPr>
+          <w:ilvl w:val="0"/>
+          <w:numId w:val="7"/>
+        </w:numPr>
+        <w:rPr>
+          <w:rFonts w:cstheme="minorHAnsi"/>
+          <w:lang w:val="en-US"/>
+        </w:rPr>
+      </w:pPr>
+      <w:r>
+        <w:rPr>
+          <w:rFonts w:cstheme="minorHAnsi"/>
+          <w:lang w:val="en-US"/>
+        </w:rPr>
+        <w:t>Another benefit: unit testing your code becomes dramatically easier.</w:t>
+      </w:r>
+    </w:p>
+    <w:p>
+      <w:pPr>
+        <w:pStyle w:val="ListParagraph"/>
+        <w:numPr>
+          <w:ilvl w:val="0"/>
+          <w:numId w:val="7"/>
+        </w:numPr>
+        <w:rPr>
+          <w:rFonts w:cstheme="minorHAnsi"/>
+          <w:lang w:val="en-US"/>
+        </w:rPr>
+      </w:pPr>
+      <w:r>
+        <w:rPr>
+          <w:rFonts w:cstheme="minorHAnsi"/>
+          <w:b/>
+          <w:lang w:val="en-US"/>
+        </w:rPr>
+        <w:t>What are interfaces?</w:t>
+      </w:r>
+      <w:r>
+        <w:rPr>
+          <w:rFonts w:cstheme="minorHAnsi"/>
+          <w:lang w:val="en-US"/>
+        </w:rPr>
+        <w:t xml:space="preserve"> Kind of the same as class inheritance or extensions. Any class that shares an interface, must have all the methods/properties from that interface implemented. (The actual implementation, of course, can vary/be modified.)</w:t>
+      </w:r>
+    </w:p>
+    <w:p>
+      <w:pPr>
+        <w:pStyle w:val="ListParagraph"/>
+        <w:numPr>
+          <w:ilvl w:val="1"/>
+          <w:numId w:val="7"/>
+        </w:numPr>
+        <w:rPr>
+          <w:rFonts w:cstheme="minorHAnsi"/>
+          <w:lang w:val="en-US"/>
+        </w:rPr>
+      </w:pPr>
+      <w:r>
+        <w:rPr>
+          <w:rFonts w:cstheme="minorHAnsi"/>
+          <w:lang w:val="en-US"/>
+        </w:rPr>
+        <w:t xml:space="preserve">Unity introduction Interfaces: </w:t>
+      </w:r>
+      <w:hyperlink r:id="rId9" w:history="1">
+        <w:r>
+          <w:rPr>
+            <w:rStyle w:val="Hyperlink"/>
+            <w:rFonts w:cstheme="minorHAnsi"/>
+            <w:lang w:val="en-US"/>
+          </w:rPr>
+          <w:t>https://www.youtube.com/watch?v=50_qBoKGKxs</w:t>
+        </w:r>
+      </w:hyperlink>
+      <w:r>
+        <w:rPr>
+          <w:rFonts w:cstheme="minorHAnsi"/>
+          <w:lang w:val="en-US"/>
+        </w:rPr>
+        <w:t xml:space="preserve"> </w:t>
+      </w:r>
+    </w:p>
+    <w:p>
+      <w:pPr>
+        <w:pStyle w:val="ListParagraph"/>
+        <w:numPr>
+          <w:ilvl w:val="1"/>
+          <w:numId w:val="7"/>
+        </w:numPr>
+        <w:rPr>
+          <w:rFonts w:cstheme="minorHAnsi"/>
+          <w:lang w:val="en-US"/>
+        </w:rPr>
+      </w:pPr>
+      <w:r>
+        <w:rPr>
+          <w:rFonts w:cstheme="minorHAnsi"/>
+          <w:lang w:val="en-US"/>
+        </w:rPr>
+        <w:t xml:space="preserve">INHERITENCE: Class B </w:t>
+      </w:r>
+      <w:r>
+        <w:rPr>
+          <w:rFonts w:cstheme="minorHAnsi"/>
+          <w:b/>
+          <w:lang w:val="en-US"/>
+        </w:rPr>
+        <w:t>is a</w:t>
+      </w:r>
+      <w:r>
+        <w:rPr>
+          <w:lang w:val="en-US"/>
+        </w:rPr>
+        <w:t xml:space="preserve"> Class A</w:t>
+      </w:r>
+    </w:p>
+    <w:p>
+      <w:pPr>
+        <w:pStyle w:val="ListParagraph"/>
+        <w:numPr>
+          <w:ilvl w:val="1"/>
+          <w:numId w:val="7"/>
+        </w:numPr>
+        <w:rPr>
+          <w:rFonts w:cstheme="minorHAnsi"/>
+          <w:lang w:val="en-US"/>
+        </w:rPr>
+      </w:pPr>
+      <w:r>
+        <w:rPr>
+          <w:rFonts w:cstheme="minorHAnsi"/>
+          <w:lang w:val="en-US"/>
+        </w:rPr>
+        <w:t xml:space="preserve">INTERFACES: Class B </w:t>
+      </w:r>
+      <w:r>
+        <w:rPr>
+          <w:rFonts w:cstheme="minorHAnsi"/>
+          <w:b/>
+          <w:lang w:val="en-US"/>
+        </w:rPr>
+        <w:t>implements</w:t>
+      </w:r>
+      <w:r>
+        <w:rPr>
+          <w:rFonts w:cstheme="minorHAnsi"/>
+          <w:lang w:val="en-US"/>
+        </w:rPr>
+        <w:t xml:space="preserve"> Class A</w:t>
       </w:r>
       <w:bookmarkStart w:id="0" w:name="_GoBack"/>
       <w:bookmarkEnd w:id="0"/>
-      <w:r>
-        <w:rPr>
-          <w:rFonts w:cstheme="minorHAnsi"/>
-          <w:lang w:val="en-US"/>
-        </w:rPr>
-        <w:t xml:space="preserve"> look at each other.</w:t>
-      </w:r>
-    </w:p>
-    <w:p>
-      <w:pPr>
-        <w:rPr>
-          <w:rFonts w:cstheme="minorHAnsi"/>
-          <w:lang w:val="en-US"/>
-        </w:rPr>
-      </w:pPr>
-      <w:r>
-        <w:rPr>
-          <w:rFonts w:cstheme="minorHAnsi"/>
-          <w:b/>
-          <w:lang w:val="en-US"/>
-        </w:rPr>
-        <w:t>Rule #2:</w:t>
-      </w:r>
-      <w:r>
-        <w:rPr>
-          <w:rFonts w:cstheme="minorHAnsi"/>
-          <w:lang w:val="en-US"/>
-        </w:rPr>
-        <w:t xml:space="preserve"> To win the stage, one player must step backwards from a height, and fall on top of the other player (“into their arms”)</w:t>
+    </w:p>
+    <w:p>
+      <w:pPr>
+        <w:rPr>
+          <w:rFonts w:cstheme="minorHAnsi"/>
+          <w:lang w:val="en-US"/>
+        </w:rPr>
+      </w:pPr>
+    </w:p>
+    <w:p>
+      <w:pPr>
+        <w:rPr>
+          <w:rFonts w:cstheme="minorHAnsi"/>
+          <w:lang w:val="en-US"/>
+        </w:rPr>
+      </w:pPr>
+      <w:r>
+        <w:rPr>
+          <w:rFonts w:cstheme="minorHAnsi"/>
+          <w:b/>
+          <w:lang w:val="en-US"/>
+        </w:rPr>
+        <w:t>Mistake #</w:t>
+      </w:r>
+      <w:r>
+        <w:rPr>
+          <w:rFonts w:cstheme="minorHAnsi"/>
+          <w:b/>
+          <w:lang w:val="en-US"/>
+        </w:rPr>
+        <w:t>7</w:t>
+      </w:r>
+      <w:r>
+        <w:rPr>
+          <w:rFonts w:cstheme="minorHAnsi"/>
+          <w:b/>
+          <w:lang w:val="en-US"/>
+        </w:rPr>
+        <w:t>:</w:t>
+      </w:r>
+      <w:r>
+        <w:rPr>
+          <w:rFonts w:cstheme="minorHAnsi"/>
+          <w:lang w:val="en-US"/>
+        </w:rPr>
+        <w:t xml:space="preserve"> </w:t>
+      </w:r>
+      <w:r>
+        <w:rPr>
+          <w:rFonts w:cstheme="minorHAnsi"/>
+          <w:lang w:val="en-US"/>
+        </w:rPr>
+        <w:t>Completely ignoring garbage collection and performance issues.</w:t>
+      </w:r>
+    </w:p>
+    <w:p>
+      <w:pPr>
+        <w:pStyle w:val="ListParagraph"/>
+        <w:numPr>
+          <w:ilvl w:val="0"/>
+          <w:numId w:val="8"/>
+        </w:numPr>
+        <w:rPr>
+          <w:rFonts w:cstheme="minorHAnsi"/>
+          <w:lang w:val="en-US"/>
+        </w:rPr>
+      </w:pPr>
+      <w:r>
+        <w:rPr>
+          <w:rFonts w:cstheme="minorHAnsi"/>
+          <w:lang w:val="en-US"/>
+        </w:rPr>
+        <w:t xml:space="preserve">Of course, in tiny games, or Game Jam/Hackathon games, or the prototyping stage, it doesn’t matter and </w:t>
+      </w:r>
+      <w:proofErr w:type="spellStart"/>
+      <w:r>
+        <w:rPr>
+          <w:rFonts w:cstheme="minorHAnsi"/>
+          <w:lang w:val="en-US"/>
+        </w:rPr>
+        <w:t>nobod</w:t>
+      </w:r>
+      <w:r>
+        <w:rPr>
+          <w:rFonts w:cstheme="minorHAnsi"/>
+          <w:lang w:val="en-US"/>
+        </w:rPr>
+        <w:t>y’</w:t>
+      </w:r>
+      <w:r>
+        <w:rPr>
+          <w:rFonts w:cstheme="minorHAnsi"/>
+          <w:lang w:val="en-US"/>
+        </w:rPr>
+        <w:t>s</w:t>
+      </w:r>
+      <w:proofErr w:type="spellEnd"/>
+      <w:r>
+        <w:rPr>
+          <w:rFonts w:cstheme="minorHAnsi"/>
+          <w:lang w:val="en-US"/>
+        </w:rPr>
+        <w:t xml:space="preserve"> going to notice. </w:t>
+      </w:r>
+    </w:p>
+    <w:p>
+      <w:pPr>
+        <w:pStyle w:val="ListParagraph"/>
+        <w:numPr>
+          <w:ilvl w:val="0"/>
+          <w:numId w:val="8"/>
+        </w:numPr>
+        <w:rPr>
+          <w:rFonts w:cstheme="minorHAnsi"/>
+          <w:lang w:val="en-US"/>
+        </w:rPr>
+      </w:pPr>
+      <w:r>
+        <w:rPr>
+          <w:rFonts w:cstheme="minorHAnsi"/>
+          <w:lang w:val="en-US"/>
+        </w:rPr>
+        <w:t xml:space="preserve">Solution? </w:t>
+      </w:r>
+      <w:proofErr w:type="spellStart"/>
+      <w:r>
+        <w:rPr>
+          <w:rFonts w:cstheme="minorHAnsi"/>
+          <w:lang w:val="en-US"/>
+        </w:rPr>
+        <w:t>Everytime</w:t>
+      </w:r>
+      <w:proofErr w:type="spellEnd"/>
+      <w:r>
+        <w:rPr>
+          <w:rFonts w:cstheme="minorHAnsi"/>
+          <w:lang w:val="en-US"/>
+        </w:rPr>
+        <w:t xml:space="preserve"> you make a (significant) change, go in there and profile it. Every time.</w:t>
+      </w:r>
+    </w:p>
+    <w:p>
+      <w:pPr>
+        <w:pStyle w:val="ListParagraph"/>
+        <w:numPr>
+          <w:ilvl w:val="0"/>
+          <w:numId w:val="8"/>
+        </w:numPr>
+        <w:rPr>
+          <w:rFonts w:cstheme="minorHAnsi"/>
+          <w:lang w:val="en-US"/>
+        </w:rPr>
+      </w:pPr>
+      <w:r>
+        <w:rPr>
+          <w:rFonts w:cstheme="minorHAnsi"/>
+          <w:lang w:val="en-US"/>
+        </w:rPr>
+        <w:t>Little things like a small/tiny performance decrease, don’t sweat it. But when you see big problems (in architecture</w:t>
+      </w:r>
+      <w:proofErr w:type="gramStart"/>
+      <w:r>
+        <w:rPr>
+          <w:rFonts w:cstheme="minorHAnsi"/>
+          <w:lang w:val="en-US"/>
+        </w:rPr>
+        <w:t>), or</w:t>
+      </w:r>
+      <w:proofErr w:type="gramEnd"/>
+      <w:r>
+        <w:rPr>
+          <w:rFonts w:cstheme="minorHAnsi"/>
+          <w:lang w:val="en-US"/>
+        </w:rPr>
+        <w:t xml:space="preserve"> know there’s a better way to solve something – do it!</w:t>
+      </w:r>
+    </w:p>
+    <w:p>
+      <w:pPr>
+        <w:rPr>
+          <w:rFonts w:cstheme="minorHAnsi"/>
+          <w:lang w:val="en-US"/>
+        </w:rPr>
+      </w:pPr>
+    </w:p>
+    <w:p>
+      <w:pPr>
+        <w:rPr>
+          <w:rFonts w:cstheme="minorHAnsi"/>
+          <w:lang w:val="en-US"/>
+        </w:rPr>
+      </w:pPr>
+      <w:r>
+        <w:rPr>
+          <w:rFonts w:cstheme="minorHAnsi"/>
+          <w:b/>
+          <w:lang w:val="en-US"/>
+        </w:rPr>
+        <w:t>Mistake #</w:t>
+      </w:r>
+      <w:r>
+        <w:rPr>
+          <w:rFonts w:cstheme="minorHAnsi"/>
+          <w:b/>
+          <w:lang w:val="en-US"/>
+        </w:rPr>
+        <w:t>8</w:t>
+      </w:r>
+      <w:r>
+        <w:rPr>
+          <w:rFonts w:cstheme="minorHAnsi"/>
+          <w:b/>
+          <w:lang w:val="en-US"/>
+        </w:rPr>
+        <w:t>:</w:t>
+      </w:r>
+      <w:r>
+        <w:rPr>
+          <w:rFonts w:cstheme="minorHAnsi"/>
+          <w:lang w:val="en-US"/>
+        </w:rPr>
+        <w:t xml:space="preserve"> </w:t>
+      </w:r>
+      <w:r>
+        <w:rPr>
+          <w:rFonts w:cstheme="minorHAnsi"/>
+          <w:lang w:val="en-US"/>
+        </w:rPr>
+        <w:t>Not sharing what you’re doing (code/architecture) and not getting feedback.</w:t>
+      </w:r>
+    </w:p>
+    <w:p>
+      <w:pPr>
+        <w:rPr>
+          <w:rFonts w:cstheme="minorHAnsi"/>
+          <w:lang w:val="en-US"/>
+        </w:rPr>
+      </w:pPr>
+      <w:r>
+        <w:rPr>
+          <w:rFonts w:cstheme="minorHAnsi"/>
+          <w:lang w:val="en-US"/>
+        </w:rPr>
+        <w:t xml:space="preserve">This includes NOT looking at </w:t>
+      </w:r>
+      <w:proofErr w:type="gramStart"/>
+      <w:r>
+        <w:rPr>
+          <w:rFonts w:cstheme="minorHAnsi"/>
+          <w:lang w:val="en-US"/>
+        </w:rPr>
+        <w:t>other</w:t>
+      </w:r>
+      <w:proofErr w:type="gramEnd"/>
+      <w:r>
+        <w:rPr>
+          <w:rFonts w:cstheme="minorHAnsi"/>
+          <w:lang w:val="en-US"/>
+        </w:rPr>
+        <w:t xml:space="preserve"> people’s architecture. If you only look at your own code, you’ll never </w:t>
+      </w:r>
+      <w:proofErr w:type="gramStart"/>
+      <w:r>
+        <w:rPr>
+          <w:rFonts w:cstheme="minorHAnsi"/>
+          <w:lang w:val="en-US"/>
+        </w:rPr>
+        <w:t>learn</w:t>
+      </w:r>
+      <w:proofErr w:type="gramEnd"/>
+      <w:r>
+        <w:rPr>
+          <w:rFonts w:cstheme="minorHAnsi"/>
+          <w:lang w:val="en-US"/>
+        </w:rPr>
+        <w:t xml:space="preserve"> and you never grow.</w:t>
+      </w:r>
+    </w:p>
+    <w:p>
+      <w:pPr>
+        <w:rPr>
+          <w:rFonts w:cstheme="minorHAnsi"/>
+          <w:lang w:val="en-US"/>
+        </w:rPr>
+      </w:pPr>
+      <w:r>
+        <w:rPr>
+          <w:rFonts w:cstheme="minorHAnsi"/>
+          <w:lang w:val="en-US"/>
+        </w:rPr>
+        <w:t>Solution? Find source code for other games and inspect it!</w:t>
       </w:r>
     </w:p>
     <w:sectPr>
@@ -562,6 +2038,684 @@
 <file path=word/numbering.xml><?xml version="1.0" encoding="utf-8"?>
 <w:numbering xmlns:wpc="http://schemas.microsoft.com/office/word/2010/wordprocessingCanvas" xmlns:cx="http://schemas.microsoft.com/office/drawing/2014/chartex" xmlns:cx1="http://schemas.microsoft.com/office/drawing/2015/9/8/chartex" xmlns:cx2="http://schemas.microsoft.com/office/drawing/2015/10/21/chartex" xmlns:cx3="http://schemas.microsoft.com/office/drawing/2016/5/9/chartex" xmlns:cx4="http://schemas.microsoft.com/office/drawing/2016/5/10/chartex" xmlns:cx5="http://schemas.microsoft.com/office/drawing/2016/5/11/chartex" xmlns:cx6="http://schemas.microsoft.com/office/drawing/2016/5/12/chartex" xmlns:cx7="http://schemas.microsoft.com/office/drawing/2016/5/13/chartex" xmlns:cx8="http://schemas.microsoft.com/office/drawing/2016/5/14/chartex" xmlns:mc="http://schemas.openxmlformats.org/markup-compatibility/2006" xmlns:aink="http://schemas.microsoft.com/office/drawing/2016/ink" xmlns:am3d="http://schemas.microsoft.com/office/drawing/2017/model3d" xmlns:o="urn:schemas-microsoft-com:office:office" xmlns:r="http://schemas.openxmlformats.org/officeDocument/2006/relationships" xmlns:m="http://schemas.openxmlformats.org/officeDocument/2006/math" xmlns:v="urn:schemas-microsoft-com:vml" xmlns:wp14="http://schemas.microsoft.com/office/word/2010/wordprocessingDrawing" xmlns:wp="http://schemas.openxmlformats.org/drawingml/2006/wordprocessingDrawing" xmlns:w10="urn:schemas-microsoft-com:office:word" xmlns:w="http://schemas.openxmlformats.org/wordprocessingml/2006/main" xmlns:w14="http://schemas.microsoft.com/office/word/2010/wordml" xmlns:w15="http://schemas.microsoft.com/office/word/2012/wordml" xmlns:w16cid="http://schemas.microsoft.com/office/word/2016/wordml/cid" xmlns:w16se="http://schemas.microsoft.com/office/word/2015/wordml/symex" xmlns:wpg="http://schemas.microsoft.com/office/word/2010/wordprocessingGroup" xmlns:wpi="http://schemas.microsoft.com/office/word/2010/wordprocessingInk" xmlns:wne="http://schemas.microsoft.com/office/word/2006/wordml" xmlns:wps="http://schemas.microsoft.com/office/word/2010/wordprocessingShape" mc:Ignorable="w14 w15 w16se w16cid wp14">
   <w:abstractNum w:abstractNumId="0" w15:restartNumberingAfterBreak="0">
+    <w:nsid w:val="080724BD"/>
+    <w:multiLevelType w:val="hybridMultilevel"/>
+    <w:tmpl w:val="348E7A3A"/>
+    <w:lvl w:ilvl="0" w:tplc="04130001">
+      <w:start w:val="1"/>
+      <w:numFmt w:val="bullet"/>
+      <w:lvlText w:val=""/>
+      <w:lvlJc w:val="left"/>
+      <w:pPr>
+        <w:ind w:left="720" w:hanging="360"/>
+      </w:pPr>
+      <w:rPr>
+        <w:rFonts w:ascii="Symbol" w:hAnsi="Symbol" w:hint="default"/>
+      </w:rPr>
+    </w:lvl>
+    <w:lvl w:ilvl="1" w:tplc="04130003" w:tentative="1">
+      <w:start w:val="1"/>
+      <w:numFmt w:val="bullet"/>
+      <w:lvlText w:val="o"/>
+      <w:lvlJc w:val="left"/>
+      <w:pPr>
+        <w:ind w:left="1440" w:hanging="360"/>
+      </w:pPr>
+      <w:rPr>
+        <w:rFonts w:ascii="Courier New" w:hAnsi="Courier New" w:cs="Courier New" w:hint="default"/>
+      </w:rPr>
+    </w:lvl>
+    <w:lvl w:ilvl="2" w:tplc="04130005" w:tentative="1">
+      <w:start w:val="1"/>
+      <w:numFmt w:val="bullet"/>
+      <w:lvlText w:val=""/>
+      <w:lvlJc w:val="left"/>
+      <w:pPr>
+        <w:ind w:left="2160" w:hanging="360"/>
+      </w:pPr>
+      <w:rPr>
+        <w:rFonts w:ascii="Wingdings" w:hAnsi="Wingdings" w:hint="default"/>
+      </w:rPr>
+    </w:lvl>
+    <w:lvl w:ilvl="3" w:tplc="04130001" w:tentative="1">
+      <w:start w:val="1"/>
+      <w:numFmt w:val="bullet"/>
+      <w:lvlText w:val=""/>
+      <w:lvlJc w:val="left"/>
+      <w:pPr>
+        <w:ind w:left="2880" w:hanging="360"/>
+      </w:pPr>
+      <w:rPr>
+        <w:rFonts w:ascii="Symbol" w:hAnsi="Symbol" w:hint="default"/>
+      </w:rPr>
+    </w:lvl>
+    <w:lvl w:ilvl="4" w:tplc="04130003" w:tentative="1">
+      <w:start w:val="1"/>
+      <w:numFmt w:val="bullet"/>
+      <w:lvlText w:val="o"/>
+      <w:lvlJc w:val="left"/>
+      <w:pPr>
+        <w:ind w:left="3600" w:hanging="360"/>
+      </w:pPr>
+      <w:rPr>
+        <w:rFonts w:ascii="Courier New" w:hAnsi="Courier New" w:cs="Courier New" w:hint="default"/>
+      </w:rPr>
+    </w:lvl>
+    <w:lvl w:ilvl="5" w:tplc="04130005" w:tentative="1">
+      <w:start w:val="1"/>
+      <w:numFmt w:val="bullet"/>
+      <w:lvlText w:val=""/>
+      <w:lvlJc w:val="left"/>
+      <w:pPr>
+        <w:ind w:left="4320" w:hanging="360"/>
+      </w:pPr>
+      <w:rPr>
+        <w:rFonts w:ascii="Wingdings" w:hAnsi="Wingdings" w:hint="default"/>
+      </w:rPr>
+    </w:lvl>
+    <w:lvl w:ilvl="6" w:tplc="04130001" w:tentative="1">
+      <w:start w:val="1"/>
+      <w:numFmt w:val="bullet"/>
+      <w:lvlText w:val=""/>
+      <w:lvlJc w:val="left"/>
+      <w:pPr>
+        <w:ind w:left="5040" w:hanging="360"/>
+      </w:pPr>
+      <w:rPr>
+        <w:rFonts w:ascii="Symbol" w:hAnsi="Symbol" w:hint="default"/>
+      </w:rPr>
+    </w:lvl>
+    <w:lvl w:ilvl="7" w:tplc="04130003" w:tentative="1">
+      <w:start w:val="1"/>
+      <w:numFmt w:val="bullet"/>
+      <w:lvlText w:val="o"/>
+      <w:lvlJc w:val="left"/>
+      <w:pPr>
+        <w:ind w:left="5760" w:hanging="360"/>
+      </w:pPr>
+      <w:rPr>
+        <w:rFonts w:ascii="Courier New" w:hAnsi="Courier New" w:cs="Courier New" w:hint="default"/>
+      </w:rPr>
+    </w:lvl>
+    <w:lvl w:ilvl="8" w:tplc="04130005" w:tentative="1">
+      <w:start w:val="1"/>
+      <w:numFmt w:val="bullet"/>
+      <w:lvlText w:val=""/>
+      <w:lvlJc w:val="left"/>
+      <w:pPr>
+        <w:ind w:left="6480" w:hanging="360"/>
+      </w:pPr>
+      <w:rPr>
+        <w:rFonts w:ascii="Wingdings" w:hAnsi="Wingdings" w:hint="default"/>
+      </w:rPr>
+    </w:lvl>
+  </w:abstractNum>
+  <w:abstractNum w:abstractNumId="1" w15:restartNumberingAfterBreak="0">
+    <w:nsid w:val="08EB5150"/>
+    <w:multiLevelType w:val="hybridMultilevel"/>
+    <w:tmpl w:val="63366D44"/>
+    <w:lvl w:ilvl="0" w:tplc="04130001">
+      <w:start w:val="1"/>
+      <w:numFmt w:val="bullet"/>
+      <w:lvlText w:val=""/>
+      <w:lvlJc w:val="left"/>
+      <w:pPr>
+        <w:ind w:left="720" w:hanging="360"/>
+      </w:pPr>
+      <w:rPr>
+        <w:rFonts w:ascii="Symbol" w:hAnsi="Symbol" w:hint="default"/>
+      </w:rPr>
+    </w:lvl>
+    <w:lvl w:ilvl="1" w:tplc="04130003" w:tentative="1">
+      <w:start w:val="1"/>
+      <w:numFmt w:val="bullet"/>
+      <w:lvlText w:val="o"/>
+      <w:lvlJc w:val="left"/>
+      <w:pPr>
+        <w:ind w:left="1440" w:hanging="360"/>
+      </w:pPr>
+      <w:rPr>
+        <w:rFonts w:ascii="Courier New" w:hAnsi="Courier New" w:cs="Courier New" w:hint="default"/>
+      </w:rPr>
+    </w:lvl>
+    <w:lvl w:ilvl="2" w:tplc="04130005" w:tentative="1">
+      <w:start w:val="1"/>
+      <w:numFmt w:val="bullet"/>
+      <w:lvlText w:val=""/>
+      <w:lvlJc w:val="left"/>
+      <w:pPr>
+        <w:ind w:left="2160" w:hanging="360"/>
+      </w:pPr>
+      <w:rPr>
+        <w:rFonts w:ascii="Wingdings" w:hAnsi="Wingdings" w:hint="default"/>
+      </w:rPr>
+    </w:lvl>
+    <w:lvl w:ilvl="3" w:tplc="04130001" w:tentative="1">
+      <w:start w:val="1"/>
+      <w:numFmt w:val="bullet"/>
+      <w:lvlText w:val=""/>
+      <w:lvlJc w:val="left"/>
+      <w:pPr>
+        <w:ind w:left="2880" w:hanging="360"/>
+      </w:pPr>
+      <w:rPr>
+        <w:rFonts w:ascii="Symbol" w:hAnsi="Symbol" w:hint="default"/>
+      </w:rPr>
+    </w:lvl>
+    <w:lvl w:ilvl="4" w:tplc="04130003" w:tentative="1">
+      <w:start w:val="1"/>
+      <w:numFmt w:val="bullet"/>
+      <w:lvlText w:val="o"/>
+      <w:lvlJc w:val="left"/>
+      <w:pPr>
+        <w:ind w:left="3600" w:hanging="360"/>
+      </w:pPr>
+      <w:rPr>
+        <w:rFonts w:ascii="Courier New" w:hAnsi="Courier New" w:cs="Courier New" w:hint="default"/>
+      </w:rPr>
+    </w:lvl>
+    <w:lvl w:ilvl="5" w:tplc="04130005" w:tentative="1">
+      <w:start w:val="1"/>
+      <w:numFmt w:val="bullet"/>
+      <w:lvlText w:val=""/>
+      <w:lvlJc w:val="left"/>
+      <w:pPr>
+        <w:ind w:left="4320" w:hanging="360"/>
+      </w:pPr>
+      <w:rPr>
+        <w:rFonts w:ascii="Wingdings" w:hAnsi="Wingdings" w:hint="default"/>
+      </w:rPr>
+    </w:lvl>
+    <w:lvl w:ilvl="6" w:tplc="04130001" w:tentative="1">
+      <w:start w:val="1"/>
+      <w:numFmt w:val="bullet"/>
+      <w:lvlText w:val=""/>
+      <w:lvlJc w:val="left"/>
+      <w:pPr>
+        <w:ind w:left="5040" w:hanging="360"/>
+      </w:pPr>
+      <w:rPr>
+        <w:rFonts w:ascii="Symbol" w:hAnsi="Symbol" w:hint="default"/>
+      </w:rPr>
+    </w:lvl>
+    <w:lvl w:ilvl="7" w:tplc="04130003" w:tentative="1">
+      <w:start w:val="1"/>
+      <w:numFmt w:val="bullet"/>
+      <w:lvlText w:val="o"/>
+      <w:lvlJc w:val="left"/>
+      <w:pPr>
+        <w:ind w:left="5760" w:hanging="360"/>
+      </w:pPr>
+      <w:rPr>
+        <w:rFonts w:ascii="Courier New" w:hAnsi="Courier New" w:cs="Courier New" w:hint="default"/>
+      </w:rPr>
+    </w:lvl>
+    <w:lvl w:ilvl="8" w:tplc="04130005" w:tentative="1">
+      <w:start w:val="1"/>
+      <w:numFmt w:val="bullet"/>
+      <w:lvlText w:val=""/>
+      <w:lvlJc w:val="left"/>
+      <w:pPr>
+        <w:ind w:left="6480" w:hanging="360"/>
+      </w:pPr>
+      <w:rPr>
+        <w:rFonts w:ascii="Wingdings" w:hAnsi="Wingdings" w:hint="default"/>
+      </w:rPr>
+    </w:lvl>
+  </w:abstractNum>
+  <w:abstractNum w:abstractNumId="2" w15:restartNumberingAfterBreak="0">
+    <w:nsid w:val="1A3E7DC4"/>
+    <w:multiLevelType w:val="hybridMultilevel"/>
+    <w:tmpl w:val="13445D86"/>
+    <w:lvl w:ilvl="0" w:tplc="04130001">
+      <w:start w:val="1"/>
+      <w:numFmt w:val="bullet"/>
+      <w:lvlText w:val=""/>
+      <w:lvlJc w:val="left"/>
+      <w:pPr>
+        <w:ind w:left="720" w:hanging="360"/>
+      </w:pPr>
+      <w:rPr>
+        <w:rFonts w:ascii="Symbol" w:hAnsi="Symbol" w:hint="default"/>
+      </w:rPr>
+    </w:lvl>
+    <w:lvl w:ilvl="1" w:tplc="04130003" w:tentative="1">
+      <w:start w:val="1"/>
+      <w:numFmt w:val="bullet"/>
+      <w:lvlText w:val="o"/>
+      <w:lvlJc w:val="left"/>
+      <w:pPr>
+        <w:ind w:left="1440" w:hanging="360"/>
+      </w:pPr>
+      <w:rPr>
+        <w:rFonts w:ascii="Courier New" w:hAnsi="Courier New" w:cs="Courier New" w:hint="default"/>
+      </w:rPr>
+    </w:lvl>
+    <w:lvl w:ilvl="2" w:tplc="04130005" w:tentative="1">
+      <w:start w:val="1"/>
+      <w:numFmt w:val="bullet"/>
+      <w:lvlText w:val=""/>
+      <w:lvlJc w:val="left"/>
+      <w:pPr>
+        <w:ind w:left="2160" w:hanging="360"/>
+      </w:pPr>
+      <w:rPr>
+        <w:rFonts w:ascii="Wingdings" w:hAnsi="Wingdings" w:hint="default"/>
+      </w:rPr>
+    </w:lvl>
+    <w:lvl w:ilvl="3" w:tplc="04130001" w:tentative="1">
+      <w:start w:val="1"/>
+      <w:numFmt w:val="bullet"/>
+      <w:lvlText w:val=""/>
+      <w:lvlJc w:val="left"/>
+      <w:pPr>
+        <w:ind w:left="2880" w:hanging="360"/>
+      </w:pPr>
+      <w:rPr>
+        <w:rFonts w:ascii="Symbol" w:hAnsi="Symbol" w:hint="default"/>
+      </w:rPr>
+    </w:lvl>
+    <w:lvl w:ilvl="4" w:tplc="04130003" w:tentative="1">
+      <w:start w:val="1"/>
+      <w:numFmt w:val="bullet"/>
+      <w:lvlText w:val="o"/>
+      <w:lvlJc w:val="left"/>
+      <w:pPr>
+        <w:ind w:left="3600" w:hanging="360"/>
+      </w:pPr>
+      <w:rPr>
+        <w:rFonts w:ascii="Courier New" w:hAnsi="Courier New" w:cs="Courier New" w:hint="default"/>
+      </w:rPr>
+    </w:lvl>
+    <w:lvl w:ilvl="5" w:tplc="04130005" w:tentative="1">
+      <w:start w:val="1"/>
+      <w:numFmt w:val="bullet"/>
+      <w:lvlText w:val=""/>
+      <w:lvlJc w:val="left"/>
+      <w:pPr>
+        <w:ind w:left="4320" w:hanging="360"/>
+      </w:pPr>
+      <w:rPr>
+        <w:rFonts w:ascii="Wingdings" w:hAnsi="Wingdings" w:hint="default"/>
+      </w:rPr>
+    </w:lvl>
+    <w:lvl w:ilvl="6" w:tplc="04130001" w:tentative="1">
+      <w:start w:val="1"/>
+      <w:numFmt w:val="bullet"/>
+      <w:lvlText w:val=""/>
+      <w:lvlJc w:val="left"/>
+      <w:pPr>
+        <w:ind w:left="5040" w:hanging="360"/>
+      </w:pPr>
+      <w:rPr>
+        <w:rFonts w:ascii="Symbol" w:hAnsi="Symbol" w:hint="default"/>
+      </w:rPr>
+    </w:lvl>
+    <w:lvl w:ilvl="7" w:tplc="04130003" w:tentative="1">
+      <w:start w:val="1"/>
+      <w:numFmt w:val="bullet"/>
+      <w:lvlText w:val="o"/>
+      <w:lvlJc w:val="left"/>
+      <w:pPr>
+        <w:ind w:left="5760" w:hanging="360"/>
+      </w:pPr>
+      <w:rPr>
+        <w:rFonts w:ascii="Courier New" w:hAnsi="Courier New" w:cs="Courier New" w:hint="default"/>
+      </w:rPr>
+    </w:lvl>
+    <w:lvl w:ilvl="8" w:tplc="04130005" w:tentative="1">
+      <w:start w:val="1"/>
+      <w:numFmt w:val="bullet"/>
+      <w:lvlText w:val=""/>
+      <w:lvlJc w:val="left"/>
+      <w:pPr>
+        <w:ind w:left="6480" w:hanging="360"/>
+      </w:pPr>
+      <w:rPr>
+        <w:rFonts w:ascii="Wingdings" w:hAnsi="Wingdings" w:hint="default"/>
+      </w:rPr>
+    </w:lvl>
+  </w:abstractNum>
+  <w:abstractNum w:abstractNumId="3" w15:restartNumberingAfterBreak="0">
+    <w:nsid w:val="20505A26"/>
+    <w:multiLevelType w:val="hybridMultilevel"/>
+    <w:tmpl w:val="7CB22AEA"/>
+    <w:lvl w:ilvl="0" w:tplc="04130001">
+      <w:start w:val="1"/>
+      <w:numFmt w:val="bullet"/>
+      <w:lvlText w:val=""/>
+      <w:lvlJc w:val="left"/>
+      <w:pPr>
+        <w:ind w:left="720" w:hanging="360"/>
+      </w:pPr>
+      <w:rPr>
+        <w:rFonts w:ascii="Symbol" w:hAnsi="Symbol" w:hint="default"/>
+      </w:rPr>
+    </w:lvl>
+    <w:lvl w:ilvl="1" w:tplc="04130003" w:tentative="1">
+      <w:start w:val="1"/>
+      <w:numFmt w:val="bullet"/>
+      <w:lvlText w:val="o"/>
+      <w:lvlJc w:val="left"/>
+      <w:pPr>
+        <w:ind w:left="1440" w:hanging="360"/>
+      </w:pPr>
+      <w:rPr>
+        <w:rFonts w:ascii="Courier New" w:hAnsi="Courier New" w:cs="Courier New" w:hint="default"/>
+      </w:rPr>
+    </w:lvl>
+    <w:lvl w:ilvl="2" w:tplc="04130005" w:tentative="1">
+      <w:start w:val="1"/>
+      <w:numFmt w:val="bullet"/>
+      <w:lvlText w:val=""/>
+      <w:lvlJc w:val="left"/>
+      <w:pPr>
+        <w:ind w:left="2160" w:hanging="360"/>
+      </w:pPr>
+      <w:rPr>
+        <w:rFonts w:ascii="Wingdings" w:hAnsi="Wingdings" w:hint="default"/>
+      </w:rPr>
+    </w:lvl>
+    <w:lvl w:ilvl="3" w:tplc="04130001" w:tentative="1">
+      <w:start w:val="1"/>
+      <w:numFmt w:val="bullet"/>
+      <w:lvlText w:val=""/>
+      <w:lvlJc w:val="left"/>
+      <w:pPr>
+        <w:ind w:left="2880" w:hanging="360"/>
+      </w:pPr>
+      <w:rPr>
+        <w:rFonts w:ascii="Symbol" w:hAnsi="Symbol" w:hint="default"/>
+      </w:rPr>
+    </w:lvl>
+    <w:lvl w:ilvl="4" w:tplc="04130003" w:tentative="1">
+      <w:start w:val="1"/>
+      <w:numFmt w:val="bullet"/>
+      <w:lvlText w:val="o"/>
+      <w:lvlJc w:val="left"/>
+      <w:pPr>
+        <w:ind w:left="3600" w:hanging="360"/>
+      </w:pPr>
+      <w:rPr>
+        <w:rFonts w:ascii="Courier New" w:hAnsi="Courier New" w:cs="Courier New" w:hint="default"/>
+      </w:rPr>
+    </w:lvl>
+    <w:lvl w:ilvl="5" w:tplc="04130005" w:tentative="1">
+      <w:start w:val="1"/>
+      <w:numFmt w:val="bullet"/>
+      <w:lvlText w:val=""/>
+      <w:lvlJc w:val="left"/>
+      <w:pPr>
+        <w:ind w:left="4320" w:hanging="360"/>
+      </w:pPr>
+      <w:rPr>
+        <w:rFonts w:ascii="Wingdings" w:hAnsi="Wingdings" w:hint="default"/>
+      </w:rPr>
+    </w:lvl>
+    <w:lvl w:ilvl="6" w:tplc="04130001" w:tentative="1">
+      <w:start w:val="1"/>
+      <w:numFmt w:val="bullet"/>
+      <w:lvlText w:val=""/>
+      <w:lvlJc w:val="left"/>
+      <w:pPr>
+        <w:ind w:left="5040" w:hanging="360"/>
+      </w:pPr>
+      <w:rPr>
+        <w:rFonts w:ascii="Symbol" w:hAnsi="Symbol" w:hint="default"/>
+      </w:rPr>
+    </w:lvl>
+    <w:lvl w:ilvl="7" w:tplc="04130003" w:tentative="1">
+      <w:start w:val="1"/>
+      <w:numFmt w:val="bullet"/>
+      <w:lvlText w:val="o"/>
+      <w:lvlJc w:val="left"/>
+      <w:pPr>
+        <w:ind w:left="5760" w:hanging="360"/>
+      </w:pPr>
+      <w:rPr>
+        <w:rFonts w:ascii="Courier New" w:hAnsi="Courier New" w:cs="Courier New" w:hint="default"/>
+      </w:rPr>
+    </w:lvl>
+    <w:lvl w:ilvl="8" w:tplc="04130005" w:tentative="1">
+      <w:start w:val="1"/>
+      <w:numFmt w:val="bullet"/>
+      <w:lvlText w:val=""/>
+      <w:lvlJc w:val="left"/>
+      <w:pPr>
+        <w:ind w:left="6480" w:hanging="360"/>
+      </w:pPr>
+      <w:rPr>
+        <w:rFonts w:ascii="Wingdings" w:hAnsi="Wingdings" w:hint="default"/>
+      </w:rPr>
+    </w:lvl>
+  </w:abstractNum>
+  <w:abstractNum w:abstractNumId="4" w15:restartNumberingAfterBreak="0">
+    <w:nsid w:val="367C6AA6"/>
+    <w:multiLevelType w:val="hybridMultilevel"/>
+    <w:tmpl w:val="4BBA70B6"/>
+    <w:lvl w:ilvl="0" w:tplc="04130001">
+      <w:start w:val="1"/>
+      <w:numFmt w:val="bullet"/>
+      <w:lvlText w:val=""/>
+      <w:lvlJc w:val="left"/>
+      <w:pPr>
+        <w:ind w:left="720" w:hanging="360"/>
+      </w:pPr>
+      <w:rPr>
+        <w:rFonts w:ascii="Symbol" w:hAnsi="Symbol" w:hint="default"/>
+      </w:rPr>
+    </w:lvl>
+    <w:lvl w:ilvl="1" w:tplc="04130003" w:tentative="1">
+      <w:start w:val="1"/>
+      <w:numFmt w:val="bullet"/>
+      <w:lvlText w:val="o"/>
+      <w:lvlJc w:val="left"/>
+      <w:pPr>
+        <w:ind w:left="1440" w:hanging="360"/>
+      </w:pPr>
+      <w:rPr>
+        <w:rFonts w:ascii="Courier New" w:hAnsi="Courier New" w:cs="Courier New" w:hint="default"/>
+      </w:rPr>
+    </w:lvl>
+    <w:lvl w:ilvl="2" w:tplc="04130005" w:tentative="1">
+      <w:start w:val="1"/>
+      <w:numFmt w:val="bullet"/>
+      <w:lvlText w:val=""/>
+      <w:lvlJc w:val="left"/>
+      <w:pPr>
+        <w:ind w:left="2160" w:hanging="360"/>
+      </w:pPr>
+      <w:rPr>
+        <w:rFonts w:ascii="Wingdings" w:hAnsi="Wingdings" w:hint="default"/>
+      </w:rPr>
+    </w:lvl>
+    <w:lvl w:ilvl="3" w:tplc="04130001" w:tentative="1">
+      <w:start w:val="1"/>
+      <w:numFmt w:val="bullet"/>
+      <w:lvlText w:val=""/>
+      <w:lvlJc w:val="left"/>
+      <w:pPr>
+        <w:ind w:left="2880" w:hanging="360"/>
+      </w:pPr>
+      <w:rPr>
+        <w:rFonts w:ascii="Symbol" w:hAnsi="Symbol" w:hint="default"/>
+      </w:rPr>
+    </w:lvl>
+    <w:lvl w:ilvl="4" w:tplc="04130003" w:tentative="1">
+      <w:start w:val="1"/>
+      <w:numFmt w:val="bullet"/>
+      <w:lvlText w:val="o"/>
+      <w:lvlJc w:val="left"/>
+      <w:pPr>
+        <w:ind w:left="3600" w:hanging="360"/>
+      </w:pPr>
+      <w:rPr>
+        <w:rFonts w:ascii="Courier New" w:hAnsi="Courier New" w:cs="Courier New" w:hint="default"/>
+      </w:rPr>
+    </w:lvl>
+    <w:lvl w:ilvl="5" w:tplc="04130005" w:tentative="1">
+      <w:start w:val="1"/>
+      <w:numFmt w:val="bullet"/>
+      <w:lvlText w:val=""/>
+      <w:lvlJc w:val="left"/>
+      <w:pPr>
+        <w:ind w:left="4320" w:hanging="360"/>
+      </w:pPr>
+      <w:rPr>
+        <w:rFonts w:ascii="Wingdings" w:hAnsi="Wingdings" w:hint="default"/>
+      </w:rPr>
+    </w:lvl>
+    <w:lvl w:ilvl="6" w:tplc="04130001" w:tentative="1">
+      <w:start w:val="1"/>
+      <w:numFmt w:val="bullet"/>
+      <w:lvlText w:val=""/>
+      <w:lvlJc w:val="left"/>
+      <w:pPr>
+        <w:ind w:left="5040" w:hanging="360"/>
+      </w:pPr>
+      <w:rPr>
+        <w:rFonts w:ascii="Symbol" w:hAnsi="Symbol" w:hint="default"/>
+      </w:rPr>
+    </w:lvl>
+    <w:lvl w:ilvl="7" w:tplc="04130003" w:tentative="1">
+      <w:start w:val="1"/>
+      <w:numFmt w:val="bullet"/>
+      <w:lvlText w:val="o"/>
+      <w:lvlJc w:val="left"/>
+      <w:pPr>
+        <w:ind w:left="5760" w:hanging="360"/>
+      </w:pPr>
+      <w:rPr>
+        <w:rFonts w:ascii="Courier New" w:hAnsi="Courier New" w:cs="Courier New" w:hint="default"/>
+      </w:rPr>
+    </w:lvl>
+    <w:lvl w:ilvl="8" w:tplc="04130005" w:tentative="1">
+      <w:start w:val="1"/>
+      <w:numFmt w:val="bullet"/>
+      <w:lvlText w:val=""/>
+      <w:lvlJc w:val="left"/>
+      <w:pPr>
+        <w:ind w:left="6480" w:hanging="360"/>
+      </w:pPr>
+      <w:rPr>
+        <w:rFonts w:ascii="Wingdings" w:hAnsi="Wingdings" w:hint="default"/>
+      </w:rPr>
+    </w:lvl>
+  </w:abstractNum>
+  <w:abstractNum w:abstractNumId="5" w15:restartNumberingAfterBreak="0">
+    <w:nsid w:val="65B776F4"/>
+    <w:multiLevelType w:val="hybridMultilevel"/>
+    <w:tmpl w:val="6F8A97DC"/>
+    <w:lvl w:ilvl="0" w:tplc="04130001">
+      <w:start w:val="1"/>
+      <w:numFmt w:val="bullet"/>
+      <w:lvlText w:val=""/>
+      <w:lvlJc w:val="left"/>
+      <w:pPr>
+        <w:ind w:left="720" w:hanging="360"/>
+      </w:pPr>
+      <w:rPr>
+        <w:rFonts w:ascii="Symbol" w:hAnsi="Symbol" w:hint="default"/>
+      </w:rPr>
+    </w:lvl>
+    <w:lvl w:ilvl="1" w:tplc="04130003">
+      <w:start w:val="1"/>
+      <w:numFmt w:val="bullet"/>
+      <w:lvlText w:val="o"/>
+      <w:lvlJc w:val="left"/>
+      <w:pPr>
+        <w:ind w:left="1440" w:hanging="360"/>
+      </w:pPr>
+      <w:rPr>
+        <w:rFonts w:ascii="Courier New" w:hAnsi="Courier New" w:cs="Courier New" w:hint="default"/>
+      </w:rPr>
+    </w:lvl>
+    <w:lvl w:ilvl="2" w:tplc="04130005" w:tentative="1">
+      <w:start w:val="1"/>
+      <w:numFmt w:val="bullet"/>
+      <w:lvlText w:val=""/>
+      <w:lvlJc w:val="left"/>
+      <w:pPr>
+        <w:ind w:left="2160" w:hanging="360"/>
+      </w:pPr>
+      <w:rPr>
+        <w:rFonts w:ascii="Wingdings" w:hAnsi="Wingdings" w:hint="default"/>
+      </w:rPr>
+    </w:lvl>
+    <w:lvl w:ilvl="3" w:tplc="04130001" w:tentative="1">
+      <w:start w:val="1"/>
+      <w:numFmt w:val="bullet"/>
+      <w:lvlText w:val=""/>
+      <w:lvlJc w:val="left"/>
+      <w:pPr>
+        <w:ind w:left="2880" w:hanging="360"/>
+      </w:pPr>
+      <w:rPr>
+        <w:rFonts w:ascii="Symbol" w:hAnsi="Symbol" w:hint="default"/>
+      </w:rPr>
+    </w:lvl>
+    <w:lvl w:ilvl="4" w:tplc="04130003" w:tentative="1">
+      <w:start w:val="1"/>
+      <w:numFmt w:val="bullet"/>
+      <w:lvlText w:val="o"/>
+      <w:lvlJc w:val="left"/>
+      <w:pPr>
+        <w:ind w:left="3600" w:hanging="360"/>
+      </w:pPr>
+      <w:rPr>
+        <w:rFonts w:ascii="Courier New" w:hAnsi="Courier New" w:cs="Courier New" w:hint="default"/>
+      </w:rPr>
+    </w:lvl>
+    <w:lvl w:ilvl="5" w:tplc="04130005" w:tentative="1">
+      <w:start w:val="1"/>
+      <w:numFmt w:val="bullet"/>
+      <w:lvlText w:val=""/>
+      <w:lvlJc w:val="left"/>
+      <w:pPr>
+        <w:ind w:left="4320" w:hanging="360"/>
+      </w:pPr>
+      <w:rPr>
+        <w:rFonts w:ascii="Wingdings" w:hAnsi="Wingdings" w:hint="default"/>
+      </w:rPr>
+    </w:lvl>
+    <w:lvl w:ilvl="6" w:tplc="04130001" w:tentative="1">
+      <w:start w:val="1"/>
+      <w:numFmt w:val="bullet"/>
+      <w:lvlText w:val=""/>
+      <w:lvlJc w:val="left"/>
+      <w:pPr>
+        <w:ind w:left="5040" w:hanging="360"/>
+      </w:pPr>
+      <w:rPr>
+        <w:rFonts w:ascii="Symbol" w:hAnsi="Symbol" w:hint="default"/>
+      </w:rPr>
+    </w:lvl>
+    <w:lvl w:ilvl="7" w:tplc="04130003" w:tentative="1">
+      <w:start w:val="1"/>
+      <w:numFmt w:val="bullet"/>
+      <w:lvlText w:val="o"/>
+      <w:lvlJc w:val="left"/>
+      <w:pPr>
+        <w:ind w:left="5760" w:hanging="360"/>
+      </w:pPr>
+      <w:rPr>
+        <w:rFonts w:ascii="Courier New" w:hAnsi="Courier New" w:cs="Courier New" w:hint="default"/>
+      </w:rPr>
+    </w:lvl>
+    <w:lvl w:ilvl="8" w:tplc="04130005" w:tentative="1">
+      <w:start w:val="1"/>
+      <w:numFmt w:val="bullet"/>
+      <w:lvlText w:val=""/>
+      <w:lvlJc w:val="left"/>
+      <w:pPr>
+        <w:ind w:left="6480" w:hanging="360"/>
+      </w:pPr>
+      <w:rPr>
+        <w:rFonts w:ascii="Wingdings" w:hAnsi="Wingdings" w:hint="default"/>
+      </w:rPr>
+    </w:lvl>
+  </w:abstractNum>
+  <w:abstractNum w:abstractNumId="6" w15:restartNumberingAfterBreak="0">
     <w:nsid w:val="70943865"/>
     <w:multiLevelType w:val="hybridMultilevel"/>
     <w:tmpl w:val="62EA02F4"/>
@@ -674,7 +2828,141 @@
       </w:rPr>
     </w:lvl>
   </w:abstractNum>
+  <w:abstractNum w:abstractNumId="7" w15:restartNumberingAfterBreak="0">
+    <w:nsid w:val="7FE011DD"/>
+    <w:multiLevelType w:val="hybridMultilevel"/>
+    <w:tmpl w:val="DDDCFD20"/>
+    <w:lvl w:ilvl="0" w:tplc="04130001">
+      <w:start w:val="1"/>
+      <w:numFmt w:val="bullet"/>
+      <w:lvlText w:val=""/>
+      <w:lvlJc w:val="left"/>
+      <w:pPr>
+        <w:ind w:left="720" w:hanging="360"/>
+      </w:pPr>
+      <w:rPr>
+        <w:rFonts w:ascii="Symbol" w:hAnsi="Symbol" w:hint="default"/>
+      </w:rPr>
+    </w:lvl>
+    <w:lvl w:ilvl="1" w:tplc="04130003" w:tentative="1">
+      <w:start w:val="1"/>
+      <w:numFmt w:val="bullet"/>
+      <w:lvlText w:val="o"/>
+      <w:lvlJc w:val="left"/>
+      <w:pPr>
+        <w:ind w:left="1440" w:hanging="360"/>
+      </w:pPr>
+      <w:rPr>
+        <w:rFonts w:ascii="Courier New" w:hAnsi="Courier New" w:cs="Courier New" w:hint="default"/>
+      </w:rPr>
+    </w:lvl>
+    <w:lvl w:ilvl="2" w:tplc="04130005" w:tentative="1">
+      <w:start w:val="1"/>
+      <w:numFmt w:val="bullet"/>
+      <w:lvlText w:val=""/>
+      <w:lvlJc w:val="left"/>
+      <w:pPr>
+        <w:ind w:left="2160" w:hanging="360"/>
+      </w:pPr>
+      <w:rPr>
+        <w:rFonts w:ascii="Wingdings" w:hAnsi="Wingdings" w:hint="default"/>
+      </w:rPr>
+    </w:lvl>
+    <w:lvl w:ilvl="3" w:tplc="04130001" w:tentative="1">
+      <w:start w:val="1"/>
+      <w:numFmt w:val="bullet"/>
+      <w:lvlText w:val=""/>
+      <w:lvlJc w:val="left"/>
+      <w:pPr>
+        <w:ind w:left="2880" w:hanging="360"/>
+      </w:pPr>
+      <w:rPr>
+        <w:rFonts w:ascii="Symbol" w:hAnsi="Symbol" w:hint="default"/>
+      </w:rPr>
+    </w:lvl>
+    <w:lvl w:ilvl="4" w:tplc="04130003" w:tentative="1">
+      <w:start w:val="1"/>
+      <w:numFmt w:val="bullet"/>
+      <w:lvlText w:val="o"/>
+      <w:lvlJc w:val="left"/>
+      <w:pPr>
+        <w:ind w:left="3600" w:hanging="360"/>
+      </w:pPr>
+      <w:rPr>
+        <w:rFonts w:ascii="Courier New" w:hAnsi="Courier New" w:cs="Courier New" w:hint="default"/>
+      </w:rPr>
+    </w:lvl>
+    <w:lvl w:ilvl="5" w:tplc="04130005" w:tentative="1">
+      <w:start w:val="1"/>
+      <w:numFmt w:val="bullet"/>
+      <w:lvlText w:val=""/>
+      <w:lvlJc w:val="left"/>
+      <w:pPr>
+        <w:ind w:left="4320" w:hanging="360"/>
+      </w:pPr>
+      <w:rPr>
+        <w:rFonts w:ascii="Wingdings" w:hAnsi="Wingdings" w:hint="default"/>
+      </w:rPr>
+    </w:lvl>
+    <w:lvl w:ilvl="6" w:tplc="04130001" w:tentative="1">
+      <w:start w:val="1"/>
+      <w:numFmt w:val="bullet"/>
+      <w:lvlText w:val=""/>
+      <w:lvlJc w:val="left"/>
+      <w:pPr>
+        <w:ind w:left="5040" w:hanging="360"/>
+      </w:pPr>
+      <w:rPr>
+        <w:rFonts w:ascii="Symbol" w:hAnsi="Symbol" w:hint="default"/>
+      </w:rPr>
+    </w:lvl>
+    <w:lvl w:ilvl="7" w:tplc="04130003" w:tentative="1">
+      <w:start w:val="1"/>
+      <w:numFmt w:val="bullet"/>
+      <w:lvlText w:val="o"/>
+      <w:lvlJc w:val="left"/>
+      <w:pPr>
+        <w:ind w:left="5760" w:hanging="360"/>
+      </w:pPr>
+      <w:rPr>
+        <w:rFonts w:ascii="Courier New" w:hAnsi="Courier New" w:cs="Courier New" w:hint="default"/>
+      </w:rPr>
+    </w:lvl>
+    <w:lvl w:ilvl="8" w:tplc="04130005" w:tentative="1">
+      <w:start w:val="1"/>
+      <w:numFmt w:val="bullet"/>
+      <w:lvlText w:val=""/>
+      <w:lvlJc w:val="left"/>
+      <w:pPr>
+        <w:ind w:left="6480" w:hanging="360"/>
+      </w:pPr>
+      <w:rPr>
+        <w:rFonts w:ascii="Wingdings" w:hAnsi="Wingdings" w:hint="default"/>
+      </w:rPr>
+    </w:lvl>
+  </w:abstractNum>
   <w:num w:numId="1">
+    <w:abstractNumId w:val="6"/>
+  </w:num>
+  <w:num w:numId="2">
+    <w:abstractNumId w:val="4"/>
+  </w:num>
+  <w:num w:numId="3">
+    <w:abstractNumId w:val="7"/>
+  </w:num>
+  <w:num w:numId="4">
+    <w:abstractNumId w:val="2"/>
+  </w:num>
+  <w:num w:numId="5">
+    <w:abstractNumId w:val="3"/>
+  </w:num>
+  <w:num w:numId="6">
+    <w:abstractNumId w:val="1"/>
+  </w:num>
+  <w:num w:numId="7">
+    <w:abstractNumId w:val="5"/>
+  </w:num>
+  <w:num w:numId="8">
     <w:abstractNumId w:val="0"/>
   </w:num>
 </w:numbering>
@@ -1081,7 +3369,6 @@
   <w:style w:type="character" w:default="1" w:styleId="DefaultParagraphFont">
     <w:name w:val="Default Paragraph Font"/>
     <w:uiPriority w:val="1"/>
-    <w:semiHidden/>
     <w:unhideWhenUsed/>
   </w:style>
   <w:style w:type="table" w:default="1" w:styleId="TableNormal">
@@ -1115,6 +3402,29 @@
       <w:ind w:left="720"/>
       <w:contextualSpacing/>
     </w:pPr>
+  </w:style>
+  <w:style w:type="character" w:styleId="Hyperlink">
+    <w:name w:val="Hyperlink"/>
+    <w:basedOn w:val="DefaultParagraphFont"/>
+    <w:uiPriority w:val="99"/>
+    <w:unhideWhenUsed/>
+    <w:rsid w:val="00D06629"/>
+    <w:rPr>
+      <w:color w:val="0563C1" w:themeColor="hyperlink"/>
+      <w:u w:val="single"/>
+    </w:rPr>
+  </w:style>
+  <w:style w:type="character" w:styleId="UnresolvedMention">
+    <w:name w:val="Unresolved Mention"/>
+    <w:basedOn w:val="DefaultParagraphFont"/>
+    <w:uiPriority w:val="99"/>
+    <w:semiHidden/>
+    <w:unhideWhenUsed/>
+    <w:rsid w:val="00D06629"/>
+    <w:rPr>
+      <w:color w:val="605E5C"/>
+      <w:shd w:val="clear" w:color="auto" w:fill="E1DFDD"/>
+    </w:rPr>
   </w:style>
 </w:styles>
 </file>

</xml_diff>